<commit_message>
docs: manuscript fixes — primary/secondary population framing, 29→31 agentic actions, v2.9.7→v2.9.9, validator scope expanded
</commit_message>
<xml_diff>
--- a/docs/manuscript/SMARTSPEND_FINAL_V5.docx
+++ b/docs/manuscript/SMARTSPEND_FINAL_V5.docx
@@ -981,7 +981,7 @@
           <w:i/>
           <w:iCs/>
         </w:rPr>
-        <w:t xml:space="preserve">Financial mismanagement remains a critical and documented challenge among Filipino households, compounded by limited access to accessible, localized, and intelligent financial tools. This study designed, developed, and evaluated SmartSpend — an AI-assisted mobile financial tracking and advisory application for Android, built for parents aged 35–55 and young professionals aged 21–35 in La Union, Philippines.</w:t>
+        <w:t xml:space="preserve">Financial mismanagement remains a critical and documented challenge among Filipino households, compounded by limited access to accessible, localized, and intelligent financial tools. This study designed, developed, and evaluated SmartSpend — an AI-assisted mobile financial tracking and advisory application for Android, built primarily for parents aged 35–55 as the primary target population, and young professionals aged 21–35 as a secondary demographic, in La Union, Philippines.</w:t>
       </w:r>
     </w:p>
     <w:p>
@@ -998,7 +998,7 @@
           <w:i/>
           <w:iCs/>
         </w:rPr>
-        <w:t xml:space="preserve">SmartSpend integrates a multi-provider agentic large language model (LLM) architecture — with Gemini 3.1 Flash-Lite as the primary model and four automatic fallback providers — enabling 29 autonomous financial management actions through natural language, voice, camera, batch screenshot import (40+ platform types), and manual entry. The system operates on an offline-first SQLite database with Firebase cloud synchronization.</w:t>
+        <w:t xml:space="preserve">SmartSpend integrates a multi-provider agentic large language model (LLM) architecture — with Gemini 3.1 Flash-Lite as the primary model and four automatic fallback providers — enabling 31 autonomous financial management actions through natural language, voice, camera, batch screenshot import (40+ platform types), and manual entry. The system operates on an offline-first SQLite database with Firebase cloud synchronization.</w:t>
       </w:r>
     </w:p>
     <w:p>
@@ -4268,7 +4268,7 @@
                 <w:sz w:val="20"/>
                 <w:szCs w:val="20"/>
               </w:rPr>
-              <w:t xml:space="preserve">29 agentic</w:t>
+              <w:t xml:space="preserve">31 agentic</w:t>
             </w:r>
           </w:p>
         </w:tc>
@@ -10956,7 +10956,7 @@
           <w:sz w:val="24"/>
           <w:szCs w:val="24"/>
         </w:rPr>
-        <w:t xml:space="preserve">A total of thirty (30) respondents participated — 20 parents aged 35 to 55 and 10 young professionals aged 21 to 35. [Insert Table 3.1 Respondent Profile here after data collection.] Survey results revealed that [insert findings on expense tracking methods, budgeting frequency, and financial challenges]. These findings are consistent with BSP (2021) data indicating that a large proportion of Filipino adults do not maintain formal written budgets.</w:t>
+        <w:t xml:space="preserve">A total of thirty (30) respondents participated — 20 parents aged 35 to 55 (primary target population) and 10 young professionals aged 21 to 35 (secondary demographic), purposively selected from La Union based on the defined inclusion criteria. [Insert Table 3.1 Respondent Profile here after data collection.] Survey results revealed that [insert findings on expense tracking methods, budgeting frequency, and financial challenges]. These findings are consistent with BSP (2021) data indicating that a large proportion of Filipino adults do not maintain formal written budgets.</w:t>
       </w:r>
     </w:p>
     <w:p>
@@ -13449,7 +13449,7 @@
           <w:sz w:val="24"/>
           <w:szCs w:val="24"/>
         </w:rPr>
-        <w:t xml:space="preserve">Gemini 3.1 Flash-Lite was selected as the primary model because it offers the highest free-tier request quota (1,000 req/day), the best Filipino-English multilingual performance among free-tier models, a 1-million token context window, and native function calling support for the 29 agentic action types (Li et al., 2024; Google, 2024f). GPT-5.6 and Claude Fable 5 are paid-only — cost-prohibitive for academic deployment.</w:t>
+        <w:t xml:space="preserve">Gemini 3.1 Flash-Lite was selected as the primary model because it offers the highest free-tier request quota (1,000 req/day), the best Filipino-English multilingual performance among free-tier models, a 1-million token context window, and native function calling support for the 31 agentic action types (Li et al., 2024; Google, 2024f). GPT-5.6 and Claude Fable 5 are paid-only — cost-prohibitive for academic deployment.</w:t>
       </w:r>
     </w:p>
     <w:p>
@@ -13918,7 +13918,7 @@
                 <w:sz w:val="20"/>
                 <w:szCs w:val="20"/>
               </w:rPr>
-              <w:t xml:space="preserve">Functional app; all 29 agentic actions operational</w:t>
+              <w:t xml:space="preserve">Functional app; all 31 agentic actions operational</w:t>
             </w:r>
           </w:p>
         </w:tc>
@@ -14030,7 +14030,7 @@
                 <w:sz w:val="20"/>
                 <w:szCs w:val="20"/>
               </w:rPr>
-              <w:t xml:space="preserve">Release APKs v2.9.7; project documentation</w:t>
+              <w:t xml:space="preserve">Release APKs v2.9.9; project documentation</w:t>
             </w:r>
           </w:p>
         </w:tc>
@@ -14105,7 +14105,7 @@
           <w:b/>
           <w:bCs/>
         </w:rPr>
-        <w:t xml:space="preserve">System Development Results — SmartSpend v2.9.7</w:t>
+        <w:t xml:space="preserve">System Development Results — SmartSpend v2.9.9</w:t>
       </w:r>
     </w:p>
     <w:p>
@@ -14120,7 +14120,7 @@
           <w:sz w:val="24"/>
           <w:szCs w:val="24"/>
         </w:rPr>
-        <w:t xml:space="preserve">SmartSpend v2.9.7 was developed across seven Kanban phases. Platform: Android (Flutter/Dart); Version: 2.9.7; SQLite schema: v11, 20 tables; APK size: 44.7 MB (arm64-v8a); AI providers: 5 (auto-failover); Primary model: Gemini 3.1 Flash-Lite; Agentic actions: 29; Input modalities: 6; Screenshot platforms: 40+; Achievement badges: 23; Daily quests: 10; Currencies: 57. GitHub: https://github.com/Zushikina-kun/smartspend-app</w:t>
+        <w:t xml:space="preserve">SmartSpend v2.9.9 was developed across seven Kanban phases. Platform: Android (Flutter/Dart); Version: 2.9.9; SQLite schema: v11, 20 tables; APK size: 45 MB (arm64-v8a); AI providers: 5 (auto-failover); Primary model: Gemini 3.1 Flash-Lite; Agentic actions: 31; Input modalities: 6; Screenshot platforms: 40+; Achievement badges: 23; Daily quests: 10; Currencies: 57. GitHub: https://github.com/Zushikina-kun/smartspend-app</w:t>
       </w:r>
     </w:p>
     <w:p>
@@ -14330,7 +14330,7 @@
           <w:sz w:val="24"/>
           <w:szCs w:val="24"/>
         </w:rPr>
-        <w:t xml:space="preserve">For the second objective — system development and LLM benchmarking: SmartSpend v2.9.7 was successfully developed as a fully functional Android application. The comparative benchmarking of 15 LLM API providers confirmed Gemini 3.1 Flash-Lite as the optimal primary model — highest free-tier quota, best Filipino-English performance, native function calling, at zero cost.</w:t>
+        <w:t xml:space="preserve">For the second objective — system development and LLM benchmarking: SmartSpend v2.9.9 was successfully developed as a fully functional Android application. The comparative benchmarking of 15 LLM API providers confirmed Gemini 3.1 Flash-Lite as the optimal primary model — highest free-tier quota, best Filipino-English performance, native function calling, at zero cost.</w:t>
       </w:r>
     </w:p>
     <w:p>

</xml_diff>